<commit_message>
Add life insurance review (unclaimed benefits, living needs rider) to care manager materials
Co-Authored-By: Claude Opus 5.5 <noreply@anthropic.com>
Claude-Session: https://claude.ai/code/session_01Rdbx23RfnTPsKsVMbyaZUY
</commit_message>
<xml_diff>
--- a/ヒアリング質問リスト_初回面談.docx
+++ b/ヒアリング質問リスト_初回面談.docx
@@ -1405,6 +1405,567 @@
           <w:sz w:val="24"/>
           <w:szCs w:val="24"/>
         </w:rPr>
+        <w:t xml:space="preserve">②-2 利用者さんの保険（自分の強みを伝える質問）</w:t>
+      </w:r>
+    </w:p>
+    <w:tbl>
+      <w:tblPr>
+        <w:tblW w:type="dxa" w:w="10206"/>
+        <w:tblBorders>
+          <w:top w:val="single" w:color="BFBFBF" w:sz="4"/>
+          <w:left w:val="single" w:color="BFBFBF" w:sz="4"/>
+          <w:bottom w:val="single" w:color="BFBFBF" w:sz="4"/>
+          <w:right w:val="single" w:color="BFBFBF" w:sz="4"/>
+          <w:insideH w:val="single" w:color="BFBFBF" w:sz="4"/>
+          <w:insideV w:val="single" w:color="BFBFBF" w:sz="4"/>
+        </w:tblBorders>
+      </w:tblPr>
+      <w:tblGrid>
+        <w:gridCol w:w="500"/>
+        <w:gridCol w:w="5000"/>
+        <w:gridCol w:w="4706"/>
+      </w:tblGrid>
+      <w:tr>
+        <w:trPr>
+          <w:cantSplit/>
+          <w:tblHeader/>
+        </w:trPr>
+        <w:tc>
+          <w:tcPr>
+            <w:tcW w:type="dxa" w:w="500"/>
+            <w:shd w:fill="1F4E79" w:color="auto" w:val="clear"/>
+            <w:tcMar>
+              <w:top w:type="dxa" w:w="50"/>
+              <w:left w:type="dxa" w:w="90"/>
+              <w:bottom w:type="dxa" w:w="50"/>
+              <w:right w:type="dxa" w:w="90"/>
+            </w:tcMar>
+            <w:vAlign w:val="center"/>
+          </w:tcPr>
+          <w:p>
+            <w:pPr>
+              <w:spacing w:after="20" w:before="0" w:line="252"/>
+            </w:pPr>
+            <w:r>
+              <w:rPr>
+                <w:rFonts w:ascii="Yu Gothic" w:cs="Yu Gothic" w:eastAsia="Yu Gothic" w:hAnsi="Yu Gothic"/>
+                <w:b/>
+                <w:bCs/>
+                <w:color w:val="FFFFFF"/>
+                <w:sz w:val="17"/>
+                <w:szCs w:val="17"/>
+              </w:rPr>
+              <w:t xml:space="preserve">✓</w:t>
+            </w:r>
+          </w:p>
+        </w:tc>
+        <w:tc>
+          <w:tcPr>
+            <w:tcW w:type="dxa" w:w="5000"/>
+            <w:shd w:fill="1F4E79" w:color="auto" w:val="clear"/>
+            <w:tcMar>
+              <w:top w:type="dxa" w:w="50"/>
+              <w:left w:type="dxa" w:w="90"/>
+              <w:bottom w:type="dxa" w:w="50"/>
+              <w:right w:type="dxa" w:w="90"/>
+            </w:tcMar>
+            <w:vAlign w:val="center"/>
+          </w:tcPr>
+          <w:p>
+            <w:pPr>
+              <w:spacing w:after="20" w:before="0" w:line="252"/>
+            </w:pPr>
+            <w:r>
+              <w:rPr>
+                <w:rFonts w:ascii="Yu Gothic" w:cs="Yu Gothic" w:eastAsia="Yu Gothic" w:hAnsi="Yu Gothic"/>
+                <w:b/>
+                <w:bCs/>
+                <w:color w:val="FFFFFF"/>
+                <w:sz w:val="17"/>
+                <w:szCs w:val="17"/>
+              </w:rPr>
+              <w:t xml:space="preserve">質問</w:t>
+            </w:r>
+          </w:p>
+        </w:tc>
+        <w:tc>
+          <w:tcPr>
+            <w:tcW w:type="dxa" w:w="4706"/>
+            <w:shd w:fill="1F4E79" w:color="auto" w:val="clear"/>
+            <w:tcMar>
+              <w:top w:type="dxa" w:w="50"/>
+              <w:left w:type="dxa" w:w="90"/>
+              <w:bottom w:type="dxa" w:w="50"/>
+              <w:right w:type="dxa" w:w="90"/>
+            </w:tcMar>
+            <w:vAlign w:val="center"/>
+          </w:tcPr>
+          <w:p>
+            <w:pPr>
+              <w:spacing w:after="20" w:before="0" w:line="252"/>
+            </w:pPr>
+            <w:r>
+              <w:rPr>
+                <w:rFonts w:ascii="Yu Gothic" w:cs="Yu Gothic" w:eastAsia="Yu Gothic" w:hAnsi="Yu Gothic"/>
+                <w:b/>
+                <w:bCs/>
+                <w:color w:val="FFFFFF"/>
+                <w:sz w:val="17"/>
+                <w:szCs w:val="17"/>
+              </w:rPr>
+              <w:t xml:space="preserve">ねらい・聞き取るポイント</w:t>
+            </w:r>
+          </w:p>
+        </w:tc>
+      </w:tr>
+      <w:tr>
+        <w:trPr>
+          <w:cantSplit/>
+          <w:tblHeader w:val="false"/>
+        </w:trPr>
+        <w:tc>
+          <w:tcPr>
+            <w:tcW w:type="dxa" w:w="500"/>
+            <w:tcMar>
+              <w:top w:type="dxa" w:w="50"/>
+              <w:left w:type="dxa" w:w="90"/>
+              <w:bottom w:type="dxa" w:w="50"/>
+              <w:right w:type="dxa" w:w="90"/>
+            </w:tcMar>
+            <w:vAlign w:val="center"/>
+          </w:tcPr>
+          <w:p>
+            <w:pPr>
+              <w:spacing w:after="20" w:before="0" w:line="252"/>
+            </w:pPr>
+            <w:r>
+              <w:rPr>
+                <w:rFonts w:ascii="Yu Gothic" w:cs="Yu Gothic" w:eastAsia="Yu Gothic" w:hAnsi="Yu Gothic"/>
+                <w:sz w:val="17"/>
+                <w:szCs w:val="17"/>
+              </w:rPr>
+              <w:t xml:space="preserve">□</w:t>
+            </w:r>
+          </w:p>
+        </w:tc>
+        <w:tc>
+          <w:tcPr>
+            <w:tcW w:type="dxa" w:w="5000"/>
+            <w:tcMar>
+              <w:top w:type="dxa" w:w="50"/>
+              <w:left w:type="dxa" w:w="90"/>
+              <w:bottom w:type="dxa" w:w="50"/>
+              <w:right w:type="dxa" w:w="90"/>
+            </w:tcMar>
+            <w:vAlign w:val="center"/>
+          </w:tcPr>
+          <w:p>
+            <w:pPr>
+              <w:spacing w:after="20" w:before="0" w:line="252"/>
+            </w:pPr>
+            <w:r>
+              <w:rPr>
+                <w:rFonts w:ascii="Yu Gothic" w:cs="Yu Gothic" w:eastAsia="Yu Gothic" w:hAnsi="Yu Gothic"/>
+                <w:b w:val="false"/>
+                <w:bCs w:val="false"/>
+                <w:sz w:val="17"/>
+                <w:szCs w:val="17"/>
+              </w:rPr>
+              <w:t xml:space="preserve">入院や手術のあと、保険の請求をしたかどうか話題になることはありますか？</w:t>
+            </w:r>
+          </w:p>
+        </w:tc>
+        <w:tc>
+          <w:tcPr>
+            <w:tcW w:type="dxa" w:w="4706"/>
+            <w:tcMar>
+              <w:top w:type="dxa" w:w="50"/>
+              <w:left w:type="dxa" w:w="90"/>
+              <w:bottom w:type="dxa" w:w="50"/>
+              <w:right w:type="dxa" w:w="90"/>
+            </w:tcMar>
+            <w:vAlign w:val="center"/>
+          </w:tcPr>
+          <w:p>
+            <w:pPr>
+              <w:spacing w:after="20" w:before="0" w:line="252"/>
+            </w:pPr>
+            <w:r>
+              <w:rPr>
+                <w:rFonts w:ascii="Yu Gothic" w:cs="Yu Gothic" w:eastAsia="Yu Gothic" w:hAnsi="Yu Gothic"/>
+                <w:b w:val="false"/>
+                <w:bCs w:val="false"/>
+                <w:sz w:val="17"/>
+                <w:szCs w:val="17"/>
+              </w:rPr>
+              <w:t xml:space="preserve">請求漏れの可能性に気づいてもらう入り口。「実は請求できたケース」を1つ紹介すると伝わりやすい</w:t>
+            </w:r>
+          </w:p>
+        </w:tc>
+      </w:tr>
+      <w:tr>
+        <w:trPr>
+          <w:cantSplit/>
+          <w:tblHeader w:val="false"/>
+        </w:trPr>
+        <w:tc>
+          <w:tcPr>
+            <w:tcW w:type="dxa" w:w="500"/>
+            <w:shd w:fill="F2F7FC" w:color="auto" w:val="clear"/>
+            <w:tcMar>
+              <w:top w:type="dxa" w:w="50"/>
+              <w:left w:type="dxa" w:w="90"/>
+              <w:bottom w:type="dxa" w:w="50"/>
+              <w:right w:type="dxa" w:w="90"/>
+            </w:tcMar>
+            <w:vAlign w:val="center"/>
+          </w:tcPr>
+          <w:p>
+            <w:pPr>
+              <w:spacing w:after="20" w:before="0" w:line="252"/>
+            </w:pPr>
+            <w:r>
+              <w:rPr>
+                <w:rFonts w:ascii="Yu Gothic" w:cs="Yu Gothic" w:eastAsia="Yu Gothic" w:hAnsi="Yu Gothic"/>
+                <w:sz w:val="17"/>
+                <w:szCs w:val="17"/>
+              </w:rPr>
+              <w:t xml:space="preserve">□</w:t>
+            </w:r>
+          </w:p>
+        </w:tc>
+        <w:tc>
+          <w:tcPr>
+            <w:tcW w:type="dxa" w:w="5000"/>
+            <w:shd w:fill="F2F7FC" w:color="auto" w:val="clear"/>
+            <w:tcMar>
+              <w:top w:type="dxa" w:w="50"/>
+              <w:left w:type="dxa" w:w="90"/>
+              <w:bottom w:type="dxa" w:w="50"/>
+              <w:right w:type="dxa" w:w="90"/>
+            </w:tcMar>
+            <w:vAlign w:val="center"/>
+          </w:tcPr>
+          <w:p>
+            <w:pPr>
+              <w:spacing w:after="20" w:before="0" w:line="252"/>
+            </w:pPr>
+            <w:r>
+              <w:rPr>
+                <w:rFonts w:ascii="Yu Gothic" w:cs="Yu Gothic" w:eastAsia="Yu Gothic" w:hAnsi="Yu Gothic"/>
+                <w:b w:val="false"/>
+                <w:bCs w:val="false"/>
+                <w:sz w:val="17"/>
+                <w:szCs w:val="17"/>
+              </w:rPr>
+              <w:t xml:space="preserve">要介護認定や区分の変更で、保険が使えることがあるのはご存じでしたか？</w:t>
+            </w:r>
+          </w:p>
+        </w:tc>
+        <w:tc>
+          <w:tcPr>
+            <w:tcW w:type="dxa" w:w="4706"/>
+            <w:shd w:fill="F2F7FC" w:color="auto" w:val="clear"/>
+            <w:tcMar>
+              <w:top w:type="dxa" w:w="50"/>
+              <w:left w:type="dxa" w:w="90"/>
+              <w:bottom w:type="dxa" w:w="50"/>
+              <w:right w:type="dxa" w:w="90"/>
+            </w:tcMar>
+            <w:vAlign w:val="center"/>
+          </w:tcPr>
+          <w:p>
+            <w:pPr>
+              <w:spacing w:after="20" w:before="0" w:line="252"/>
+            </w:pPr>
+            <w:r>
+              <w:rPr>
+                <w:rFonts w:ascii="Yu Gothic" w:cs="Yu Gothic" w:eastAsia="Yu Gothic" w:hAnsi="Yu Gothic"/>
+                <w:b w:val="false"/>
+                <w:bCs w:val="false"/>
+                <w:sz w:val="17"/>
+                <w:szCs w:val="17"/>
+              </w:rPr>
+              <w:t xml:space="preserve">介護特約・払込免除の認知度を確認。知らなければ勉強会テーマの根拠になる</w:t>
+            </w:r>
+          </w:p>
+        </w:tc>
+      </w:tr>
+      <w:tr>
+        <w:trPr>
+          <w:cantSplit/>
+          <w:tblHeader w:val="false"/>
+        </w:trPr>
+        <w:tc>
+          <w:tcPr>
+            <w:tcW w:type="dxa" w:w="500"/>
+            <w:tcMar>
+              <w:top w:type="dxa" w:w="50"/>
+              <w:left w:type="dxa" w:w="90"/>
+              <w:bottom w:type="dxa" w:w="50"/>
+              <w:right w:type="dxa" w:w="90"/>
+            </w:tcMar>
+            <w:vAlign w:val="center"/>
+          </w:tcPr>
+          <w:p>
+            <w:pPr>
+              <w:spacing w:after="20" w:before="0" w:line="252"/>
+            </w:pPr>
+            <w:r>
+              <w:rPr>
+                <w:rFonts w:ascii="Yu Gothic" w:cs="Yu Gothic" w:eastAsia="Yu Gothic" w:hAnsi="Yu Gothic"/>
+                <w:sz w:val="17"/>
+                <w:szCs w:val="17"/>
+              </w:rPr>
+              <w:t xml:space="preserve">□</w:t>
+            </w:r>
+          </w:p>
+        </w:tc>
+        <w:tc>
+          <w:tcPr>
+            <w:tcW w:type="dxa" w:w="5000"/>
+            <w:tcMar>
+              <w:top w:type="dxa" w:w="50"/>
+              <w:left w:type="dxa" w:w="90"/>
+              <w:bottom w:type="dxa" w:w="50"/>
+              <w:right w:type="dxa" w:w="90"/>
+            </w:tcMar>
+            <w:vAlign w:val="center"/>
+          </w:tcPr>
+          <w:p>
+            <w:pPr>
+              <w:spacing w:after="20" w:before="0" w:line="252"/>
+            </w:pPr>
+            <w:r>
+              <w:rPr>
+                <w:rFonts w:ascii="Yu Gothic" w:cs="Yu Gothic" w:eastAsia="Yu Gothic" w:hAnsi="Yu Gothic"/>
+                <w:b w:val="false"/>
+                <w:bCs w:val="false"/>
+                <w:sz w:val="17"/>
+                <w:szCs w:val="17"/>
+              </w:rPr>
+              <w:t xml:space="preserve">ご家族が、親の入っている保険を把握していないケースは多いですか？</w:t>
+            </w:r>
+          </w:p>
+        </w:tc>
+        <w:tc>
+          <w:tcPr>
+            <w:tcW w:type="dxa" w:w="4706"/>
+            <w:tcMar>
+              <w:top w:type="dxa" w:w="50"/>
+              <w:left w:type="dxa" w:w="90"/>
+              <w:bottom w:type="dxa" w:w="50"/>
+              <w:right w:type="dxa" w:w="90"/>
+            </w:tcMar>
+            <w:vAlign w:val="center"/>
+          </w:tcPr>
+          <w:p>
+            <w:pPr>
+              <w:spacing w:after="20" w:before="0" w:line="252"/>
+            </w:pPr>
+            <w:r>
+              <w:rPr>
+                <w:rFonts w:ascii="Yu Gothic" w:cs="Yu Gothic" w:eastAsia="Yu Gothic" w:hAnsi="Yu Gothic"/>
+                <w:b w:val="false"/>
+                <w:bCs w:val="false"/>
+                <w:sz w:val="17"/>
+                <w:szCs w:val="17"/>
+              </w:rPr>
+              <w:t xml:space="preserve">契約一覧の作成・照会制度のニーズ</w:t>
+            </w:r>
+          </w:p>
+        </w:tc>
+      </w:tr>
+      <w:tr>
+        <w:trPr>
+          <w:cantSplit/>
+          <w:tblHeader w:val="false"/>
+        </w:trPr>
+        <w:tc>
+          <w:tcPr>
+            <w:tcW w:type="dxa" w:w="500"/>
+            <w:shd w:fill="F2F7FC" w:color="auto" w:val="clear"/>
+            <w:tcMar>
+              <w:top w:type="dxa" w:w="50"/>
+              <w:left w:type="dxa" w:w="90"/>
+              <w:bottom w:type="dxa" w:w="50"/>
+              <w:right w:type="dxa" w:w="90"/>
+            </w:tcMar>
+            <w:vAlign w:val="center"/>
+          </w:tcPr>
+          <w:p>
+            <w:pPr>
+              <w:spacing w:after="20" w:before="0" w:line="252"/>
+            </w:pPr>
+            <w:r>
+              <w:rPr>
+                <w:rFonts w:ascii="Yu Gothic" w:cs="Yu Gothic" w:eastAsia="Yu Gothic" w:hAnsi="Yu Gothic"/>
+                <w:sz w:val="17"/>
+                <w:szCs w:val="17"/>
+              </w:rPr>
+              <w:t xml:space="preserve">□</w:t>
+            </w:r>
+          </w:p>
+        </w:tc>
+        <w:tc>
+          <w:tcPr>
+            <w:tcW w:type="dxa" w:w="5000"/>
+            <w:shd w:fill="F2F7FC" w:color="auto" w:val="clear"/>
+            <w:tcMar>
+              <w:top w:type="dxa" w:w="50"/>
+              <w:left w:type="dxa" w:w="90"/>
+              <w:bottom w:type="dxa" w:w="50"/>
+              <w:right w:type="dxa" w:w="90"/>
+            </w:tcMar>
+            <w:vAlign w:val="center"/>
+          </w:tcPr>
+          <w:p>
+            <w:pPr>
+              <w:spacing w:after="20" w:before="0" w:line="252"/>
+            </w:pPr>
+            <w:r>
+              <w:rPr>
+                <w:rFonts w:ascii="Yu Gothic" w:cs="Yu Gothic" w:eastAsia="Yu Gothic" w:hAnsi="Yu Gothic"/>
+                <w:b w:val="false"/>
+                <w:bCs w:val="false"/>
+                <w:sz w:val="17"/>
+                <w:szCs w:val="17"/>
+              </w:rPr>
+              <w:t xml:space="preserve">ターミナル期の方で、療養費や最期の過ごし方の費用を心配されるケースは？</w:t>
+            </w:r>
+          </w:p>
+        </w:tc>
+        <w:tc>
+          <w:tcPr>
+            <w:tcW w:type="dxa" w:w="4706"/>
+            <w:shd w:fill="F2F7FC" w:color="auto" w:val="clear"/>
+            <w:tcMar>
+              <w:top w:type="dxa" w:w="50"/>
+              <w:left w:type="dxa" w:w="90"/>
+              <w:bottom w:type="dxa" w:w="50"/>
+              <w:right w:type="dxa" w:w="90"/>
+            </w:tcMar>
+            <w:vAlign w:val="center"/>
+          </w:tcPr>
+          <w:p>
+            <w:pPr>
+              <w:spacing w:after="20" w:before="0" w:line="252"/>
+            </w:pPr>
+            <w:r>
+              <w:rPr>
+                <w:rFonts w:ascii="Yu Gothic" w:cs="Yu Gothic" w:eastAsia="Yu Gothic" w:hAnsi="Yu Gothic"/>
+                <w:b w:val="false"/>
+                <w:bCs w:val="false"/>
+                <w:sz w:val="17"/>
+                <w:szCs w:val="17"/>
+              </w:rPr>
+              <w:t xml:space="preserve">リビングニーズ特約の出番。告知の状況や医療職との連携の仕方もあわせて聞く</w:t>
+            </w:r>
+          </w:p>
+        </w:tc>
+      </w:tr>
+      <w:tr>
+        <w:trPr>
+          <w:cantSplit/>
+          <w:tblHeader w:val="false"/>
+        </w:trPr>
+        <w:tc>
+          <w:tcPr>
+            <w:tcW w:type="dxa" w:w="500"/>
+            <w:tcMar>
+              <w:top w:type="dxa" w:w="50"/>
+              <w:left w:type="dxa" w:w="90"/>
+              <w:bottom w:type="dxa" w:w="50"/>
+              <w:right w:type="dxa" w:w="90"/>
+            </w:tcMar>
+            <w:vAlign w:val="center"/>
+          </w:tcPr>
+          <w:p>
+            <w:pPr>
+              <w:spacing w:after="20" w:before="0" w:line="252"/>
+            </w:pPr>
+            <w:r>
+              <w:rPr>
+                <w:rFonts w:ascii="Yu Gothic" w:cs="Yu Gothic" w:eastAsia="Yu Gothic" w:hAnsi="Yu Gothic"/>
+                <w:sz w:val="17"/>
+                <w:szCs w:val="17"/>
+              </w:rPr>
+              <w:t xml:space="preserve">□</w:t>
+            </w:r>
+          </w:p>
+        </w:tc>
+        <w:tc>
+          <w:tcPr>
+            <w:tcW w:type="dxa" w:w="5000"/>
+            <w:tcMar>
+              <w:top w:type="dxa" w:w="50"/>
+              <w:left w:type="dxa" w:w="90"/>
+              <w:bottom w:type="dxa" w:w="50"/>
+              <w:right w:type="dxa" w:w="90"/>
+            </w:tcMar>
+            <w:vAlign w:val="center"/>
+          </w:tcPr>
+          <w:p>
+            <w:pPr>
+              <w:spacing w:after="20" w:before="0" w:line="252"/>
+            </w:pPr>
+            <w:r>
+              <w:rPr>
+                <w:rFonts w:ascii="Yu Gothic" w:cs="Yu Gothic" w:eastAsia="Yu Gothic" w:hAnsi="Yu Gothic"/>
+                <w:b w:val="false"/>
+                <w:bCs w:val="false"/>
+                <w:sz w:val="17"/>
+                <w:szCs w:val="17"/>
+              </w:rPr>
+              <w:t xml:space="preserve">本人が手続きできず、ご家族が保険の請求に困ったことは？</w:t>
+            </w:r>
+          </w:p>
+        </w:tc>
+        <w:tc>
+          <w:tcPr>
+            <w:tcW w:type="dxa" w:w="4706"/>
+            <w:tcMar>
+              <w:top w:type="dxa" w:w="50"/>
+              <w:left w:type="dxa" w:w="90"/>
+              <w:bottom w:type="dxa" w:w="50"/>
+              <w:right w:type="dxa" w:w="90"/>
+            </w:tcMar>
+            <w:vAlign w:val="center"/>
+          </w:tcPr>
+          <w:p>
+            <w:pPr>
+              <w:spacing w:after="20" w:before="0" w:line="252"/>
+            </w:pPr>
+            <w:r>
+              <w:rPr>
+                <w:rFonts w:ascii="Yu Gothic" w:cs="Yu Gothic" w:eastAsia="Yu Gothic" w:hAnsi="Yu Gothic"/>
+                <w:b w:val="false"/>
+                <w:bCs w:val="false"/>
+                <w:sz w:val="17"/>
+                <w:szCs w:val="17"/>
+              </w:rPr>
+              <w:t xml:space="preserve">指定代理請求の活用余地</w:t>
+            </w:r>
+          </w:p>
+        </w:tc>
+      </w:tr>
+    </w:tbl>
+    <w:p>
+      <w:pPr>
+        <w:pBdr>
+          <w:bottom w:val="single" w:color="1F4E79" w:sz="8" w:space="2"/>
+        </w:pBdr>
+        <w:spacing w:after="80" w:before="160"/>
+      </w:pPr>
+      <w:r>
+        <w:rPr>
+          <w:rFonts w:ascii="Yu Gothic" w:cs="Yu Gothic" w:eastAsia="Yu Gothic" w:hAnsi="Yu Gothic"/>
+          <w:b/>
+          <w:bCs/>
+          <w:color w:val="1F4E79"/>
+          <w:sz w:val="24"/>
+          <w:szCs w:val="24"/>
+        </w:rPr>
         <w:t xml:space="preserve">③ 今の連携先・情報源</w:t>
       </w:r>
     </w:p>
@@ -2893,7 +3454,7 @@
           <w:sz w:val="20"/>
           <w:szCs w:val="20"/>
         </w:rPr>
-        <w:t xml:space="preserve">初回から保険・金融商品の話をする、パンフレットを広げる</w:t>
+        <w:t xml:space="preserve">保険の新規加入・見直しを勧める、商品パンフレットを広げる（話すのは「今ある保険を活かす整理」まで）</w:t>
       </w:r>
     </w:p>
     <w:p>

</xml_diff>